<commit_message>
Corrige a titularidade do RG e do CPF para a Contratada
O RG 46.270.985-1 e o CPF 386.386.288-03 são da prestadora, não do
representante da Mediterrâneo. Os campos da CONTRATANTE voltam a ficar
em branco.

- Qualificação e bloco de assinatura da CONTRATADA preenchidos.
- Anexo V passa a identificar a titular que designa o Preposto.

Co-Authored-By: Claude Opus 5 <noreply@anthropic.com>
Claude-Session: https://claude.ai/code/session_01JvuJwy7yY4EnoYMkQynCaG
</commit_message>
<xml_diff>
--- a/docs/juridico/anexos-contrato-zeladoria.docx
+++ b/docs/juridico/anexos-contrato-zeladoria.docx
@@ -13317,7 +13317,19 @@
         <w:rPr>
           <w:b w:val="0"/>
         </w:rPr>
-        <w:t xml:space="preserve">, CNPJ 19.525.600/0001-00, na qualidade de CONTRATADA no Contrato nº ZHG/MED/ZEL-001/2026, </w:t>
+        <w:t xml:space="preserve">, CNPJ 19.525.600/0001-00, representada por sua titular </w:t>
+      </w:r>
+      <w:r>
+        <w:rPr>
+          <w:b/>
+        </w:rPr>
+        <w:t>Camila Rabelo Glicerio Gois</w:t>
+      </w:r>
+      <w:r>
+        <w:rPr>
+          <w:b w:val="0"/>
+        </w:rPr>
+        <w:t xml:space="preserve">, CPF 386.386.288-03, RG 46.270.985-1, na qualidade de CONTRATADA no Contrato nº ZHG/MED/ZEL-001/2026, </w:t>
       </w:r>
       <w:r>
         <w:rPr>

</xml_diff>